<commit_message>
refactor: migrate system to modular monolith + add Series API endpoints
</commit_message>
<xml_diff>
--- a/manga-erp-srs-v2.docx
+++ b/manga-erp-srs-v2.docx
@@ -1,5 +1,27 @@
 
-<file path=word/document.xml><?xml version="1.0" encoding="utf-8"?>
+<file path=docProps\app.xml><?xml version="1.0" encoding="utf-8"?>
+<Properties xmlns="http://schemas.openxmlformats.org/officeDocument/2006/extended-properties" xmlns:vt="http://schemas.openxmlformats.org/officeDocument/2006/docPropsVTypes"/>
+</file>
+
+<file path=docProps\core.xml><?xml version="1.0" encoding="utf-8"?>
+<cp:coreProperties xmlns:cp="http://schemas.openxmlformats.org/package/2006/metadata/core-properties" xmlns:dc="http://purl.org/dc/elements/1.1/" xmlns:dcterms="http://purl.org/dc/terms/" xmlns:dcmitype="http://purl.org/dc/dcmitype/" xmlns:xsi="http://www.w3.org/2001/XMLSchema-instance">
+  <dc:creator>Un-named</dc:creator>
+  <cp:lastModifiedBy>Un-named</cp:lastModifiedBy>
+  <cp:revision>1</cp:revision>
+  <dcterms:created xsi:type="dcterms:W3CDTF">2026-06-05T03:13:23.449Z</dcterms:created>
+  <dcterms:modified xsi:type="dcterms:W3CDTF">2026-06-05T03:13:23.449Z</dcterms:modified>
+</cp:coreProperties>
+</file>
+
+<file path=docProps\custom.xml><?xml version="1.0" encoding="utf-8"?>
+<Properties xmlns="http://schemas.openxmlformats.org/officeDocument/2006/custom-properties" xmlns:vt="http://schemas.openxmlformats.org/officeDocument/2006/docPropsVTypes"/>
+</file>
+
+<file path=word\comments.xml><?xml version="1.0" encoding="utf-8"?>
+<w:comments xmlns:cx="http://schemas.microsoft.com/office/drawing/2014/chartex" xmlns:cx1="http://schemas.microsoft.com/office/drawing/2015/9/8/chartex" xmlns:cx2="http://schemas.microsoft.com/office/drawing/2015/10/21/chartex" xmlns:cx3="http://schemas.microsoft.com/office/drawing/2016/5/9/chartex" xmlns:cx4="http://schemas.microsoft.com/office/drawing/2016/5/10/chartex" xmlns:cx5="http://schemas.microsoft.com/office/drawing/2016/5/11/chartex" xmlns:cx6="http://schemas.microsoft.com/office/drawing/2016/5/12/chartex" xmlns:cx7="http://schemas.microsoft.com/office/drawing/2016/5/13/chartex" xmlns:cx8="http://schemas.microsoft.com/office/drawing/2016/5/14/chartex" xmlns:mc="http://schemas.openxmlformats.org/markup-compatibility/2006" xmlns:aink="http://schemas.microsoft.com/office/drawing/2016/ink" xmlns:am3d="http://schemas.microsoft.com/office/drawing/2017/model3d" xmlns:o="urn:schemas-microsoft-com:office:office" xmlns:r="http://schemas.openxmlformats.org/officeDocument/2006/relationships" xmlns:m="http://schemas.openxmlformats.org/officeDocument/2006/math" xmlns:v="urn:schemas-microsoft-com:vml" xmlns:wp14="http://schemas.microsoft.com/office/word/2010/wordprocessingDrawing" xmlns:wp="http://schemas.openxmlformats.org/drawingml/2006/wordprocessingDrawing" xmlns:w10="urn:schemas-microsoft-com:office:word" xmlns:w="http://schemas.openxmlformats.org/wordprocessingml/2006/main" xmlns:w14="http://schemas.microsoft.com/office/word/2010/wordml" xmlns:w15="http://schemas.microsoft.com/office/word/2012/wordml" xmlns:w16cex="http://schemas.microsoft.com/office/word/2018/wordml/cex" xmlns:w16cid="http://schemas.microsoft.com/office/word/2016/wordml/cid" xmlns:w16="http://schemas.microsoft.com/office/word/2018/wordml" xmlns:w16sdtdh="http://schemas.microsoft.com/office/word/2020/wordml/sdtdatahash" xmlns:w16se="http://schemas.microsoft.com/office/word/2015/wordml/symex" xmlns:wpg="http://schemas.microsoft.com/office/word/2010/wordprocessingGroup" xmlns:wpi="http://schemas.microsoft.com/office/word/2010/wordprocessingInk" xmlns:wne="http://schemas.microsoft.com/office/word/2006/wordml" xmlns:wps="http://schemas.microsoft.com/office/word/2010/wordprocessingShape"/>
+</file>
+
+<file path=word\document.xml><?xml version="1.0" encoding="utf-8"?>
 <w:document xmlns:wpc="http://schemas.microsoft.com/office/word/2010/wordprocessingCanvas" xmlns:mc="http://schemas.openxmlformats.org/markup-compatibility/2006" xmlns:o="urn:schemas-microsoft-com:office:office" xmlns:r="http://schemas.openxmlformats.org/officeDocument/2006/relationships" xmlns:m="http://schemas.openxmlformats.org/officeDocument/2006/math" xmlns:v="urn:schemas-microsoft-com:vml" xmlns:wp14="http://schemas.microsoft.com/office/word/2010/wordprocessingDrawing" xmlns:wp="http://schemas.openxmlformats.org/drawingml/2006/wordprocessingDrawing" xmlns:w10="urn:schemas-microsoft-com:office:word" xmlns:w="http://schemas.openxmlformats.org/wordprocessingml/2006/main" xmlns:w14="http://schemas.microsoft.com/office/word/2010/wordml" xmlns:w15="http://schemas.microsoft.com/office/word/2012/wordml" xmlns:wpg="http://schemas.microsoft.com/office/word/2010/wordprocessingGroup" xmlns:wpi="http://schemas.microsoft.com/office/word/2010/wordprocessingInk" xmlns:wne="http://schemas.microsoft.com/office/word/2006/wordml" xmlns:wps="http://schemas.microsoft.com/office/word/2010/wordprocessingShape" xmlns:cx="http://schemas.microsoft.com/office/drawing/2014/chartex" xmlns:cx1="http://schemas.microsoft.com/office/drawing/2015/9/8/chartex" xmlns:cx2="http://schemas.microsoft.com/office/drawing/2015/10/21/chartex" xmlns:cx3="http://schemas.microsoft.com/office/drawing/2016/5/9/chartex" xmlns:cx4="http://schemas.microsoft.com/office/drawing/2016/5/10/chartex" xmlns:cx5="http://schemas.microsoft.com/office/drawing/2016/5/11/chartex" xmlns:cx6="http://schemas.microsoft.com/office/drawing/2016/5/12/chartex" xmlns:cx7="http://schemas.microsoft.com/office/drawing/2016/5/13/chartex" xmlns:cx8="http://schemas.microsoft.com/office/drawing/2016/5/14/chartex" xmlns:aink="http://schemas.microsoft.com/office/drawing/2016/ink" xmlns:am3d="http://schemas.microsoft.com/office/drawing/2017/model3d" xmlns:w16cex="http://schemas.microsoft.com/office/word/2018/wordml/cex" xmlns:w16cid="http://schemas.microsoft.com/office/word/2016/wordml/cid" xmlns:w16="http://schemas.microsoft.com/office/word/2018/wordml" xmlns:w16sdtdh="http://schemas.microsoft.com/office/word/2020/wordml/sdtdatahash" xmlns:w16se="http://schemas.microsoft.com/office/word/2015/wordml/symex" mc:Ignorable="w14 w15 wp14">
   <w:body>
     <w:p>
@@ -48,7 +70,7 @@
           <w:sz w:val="24"/>
           <w:szCs w:val="24"/>
         </w:rPr>
-        <w:t xml:space="preserve">Version 2.0 — Revised &amp; Patched</w:t>
+        <w:t xml:space="preserve">Version 2.0 â€” Revised &amp; Patched</w:t>
       </w:r>
     </w:p>
     <w:p>
@@ -130,7 +152,7 @@
           <w:sz w:val="21"/>
           <w:szCs w:val="21"/>
         </w:rPr>
-        <w:t xml:space="preserve">MF1 — Platform Bootstrap &amp; Editorial Vetting</w:t>
+        <w:t xml:space="preserve">MF1 â€” Platform Bootstrap &amp; Editorial Vetting</w:t>
       </w:r>
     </w:p>
     <w:p>
@@ -149,7 +171,7 @@
           <w:sz w:val="21"/>
           <w:szCs w:val="21"/>
         </w:rPr>
-        <w:t xml:space="preserve">MF2 — Internal Studio Pipeline &amp; Multi-layer Delegation</w:t>
+        <w:t xml:space="preserve">MF2 â€” Internal Studio Pipeline &amp; Multi-layer Delegation</w:t>
       </w:r>
     </w:p>
     <w:p>
@@ -168,7 +190,7 @@
           <w:sz w:val="21"/>
           <w:szCs w:val="21"/>
         </w:rPr>
-        <w:t xml:space="preserve">MF3 — Visual Coordinate-Based Quality Assurance &amp; Publishing</w:t>
+        <w:t xml:space="preserve">MF3 â€” Visual Coordinate-Based Quality Assurance &amp; Publishing</w:t>
       </w:r>
     </w:p>
     <w:p>
@@ -187,7 +209,7 @@
           <w:sz w:val="21"/>
           <w:szCs w:val="21"/>
         </w:rPr>
-        <w:t xml:space="preserve">MF5 — Asynchronous Queue Asset Optimization</w:t>
+        <w:t xml:space="preserve">MF5 â€” Asynchronous Queue Asset Optimization</w:t>
       </w:r>
     </w:p>
     <w:p>
@@ -206,7 +228,7 @@
           <w:sz w:val="21"/>
           <w:szCs w:val="21"/>
         </w:rPr>
-        <w:t xml:space="preserve">MF8 — High-Concurrency Cache Invalidation Edge Publishing</w:t>
+        <w:t xml:space="preserve">MF8 â€” High-Concurrency Cache Invalidation Edge Publishing</w:t>
       </w:r>
     </w:p>
     <w:p>
@@ -224,7 +246,8 @@
           <w:sz w:val="22"/>
           <w:szCs w:val="22"/>
         </w:rPr>
-        <w:t xml:space="preserve"/>
+        <w:t xml:space="preserve">
+        </w:t>
       </w:r>
     </w:p>
     <w:p>
@@ -259,7 +282,7 @@
           <w:sz w:val="22"/>
           <w:szCs w:val="22"/>
         </w:rPr>
-        <w:t xml:space="preserve">The system defines six distinct actor types with strict role-based access control (RBAC). Role elevation (e.g., Reader → Mangaka) is performed atomically by the System Handler upon series approval.</w:t>
+        <w:t xml:space="preserve">The system defines six distinct actor types with strict role-based access control (RBAC). Role elevation (e.g., Reader â†’ Mangaka) is performed atomically by the System Handler upon series approval.</w:t>
       </w:r>
     </w:p>
     <w:p>
@@ -277,7 +300,8 @@
           <w:sz w:val="22"/>
           <w:szCs w:val="22"/>
         </w:rPr>
-        <w:t xml:space="preserve"/>
+        <w:t xml:space="preserve">
+        </w:t>
       </w:r>
     </w:p>
     <w:tbl>
@@ -1290,7 +1314,8 @@
           <w:sz w:val="22"/>
           <w:szCs w:val="22"/>
         </w:rPr>
-        <w:t xml:space="preserve"/>
+        <w:t xml:space="preserve">
+        </w:t>
       </w:r>
     </w:p>
     <w:p>
@@ -1313,6 +1338,481 @@
     </w:p>
     <w:p>
       <w:pPr>
+        <w:pStyle w:val="Heading2"/>
+        <w:spacing w:before="240" w:after="120"/>
+      </w:pPr>
+      <w:r>
+        <w:rPr>
+          <w:rFonts w:ascii="Arial" w:hAnsi="Arial"/>
+          <w:b/>
+          <w:sz w:val="26"/>
+        </w:rPr>
+        <w:t>2.1 Account Provisioning Workflow (Without HR)</w:t>
+      </w:r>
+    </w:p>
+    <w:p>
+      <w:pPr>
+        <w:spacing w:before="80" w:after="80"/>
+      </w:pPr>
+      <w:r>
+        <w:rPr>
+          <w:rFonts w:ascii="Arial" w:hAnsi="Arial"/>
+          <w:sz w:val="20"/>
+          <w:i/>
+        </w:rPr>
+        <w:t>Since the system does not have an HR module, account creation and provisioning are tied to operational actions and task-based trust relationships:</w:t>
+      </w:r>
+    </w:p>
+    <w:p>
+      <w:pPr>
+        <w:spacing w:before="40" w:after="40"/>
+        <w:ind w:left="360"/>
+      </w:pPr>
+      <w:r>
+        <w:rPr>
+          <w:rFonts w:ascii="Arial" w:hAnsi="Arial"/>
+          <w:sz w:val="20"/>
+        </w:rPr>
+        <w:t>â€¢ </w:t>
+      </w:r>
+      <w:r>
+        <w:rPr>
+          <w:rFonts w:ascii="Arial" w:hAnsi="Arial"/>
+          <w:b/>
+          <w:sz w:val="20"/>
+        </w:rPr>
+        <w:t>Step 1: Core Initialization (Admin &amp; Editorial Board): </w:t>
+      </w:r>
+      <w:r>
+        <w:rPr>
+          <w:rFonts w:ascii="Arial" w:hAnsi="Arial"/>
+          <w:sz w:val="20"/>
+        </w:rPr>
+        <w:t>The system starts with a single seed Admin account. When the Editorial Board is established, the Admin directly registers accounts for Editorial Board members. This is based on direct administrative trust.</w:t>
+      </w:r>
+    </w:p>
+    <w:p>
+      <w:pPr>
+        <w:spacing w:before="40" w:after="40"/>
+        <w:ind w:left="360"/>
+      </w:pPr>
+      <w:r>
+        <w:rPr>
+          <w:rFonts w:ascii="Arial" w:hAnsi="Arial"/>
+          <w:sz w:val="20"/>
+        </w:rPr>
+        <w:t>â€¢ </w:t>
+      </w:r>
+      <w:r>
+        <w:rPr>
+          <w:rFonts w:ascii="Arial" w:hAnsi="Arial"/>
+          <w:b/>
+          <w:sz w:val="20"/>
+        </w:rPr>
+        <w:t>Step 2: Operational Onboarding (Tantou Editor): </w:t>
+      </w:r>
+      <w:r>
+        <w:rPr>
+          <w:rFonts w:ascii="Arial" w:hAnsi="Arial"/>
+          <w:sz w:val="20"/>
+        </w:rPr>
+        <w:t>When a new Editor joins the team, the Editorial Board sends an internal request (or uses the system UI) to the Admin. The Admin creates the Tantou Editor account and sends the credentials.</w:t>
+      </w:r>
+    </w:p>
+    <w:p>
+      <w:pPr>
+        <w:spacing w:before="40" w:after="40"/>
+        <w:ind w:left="360"/>
+      </w:pPr>
+      <w:r>
+        <w:rPr>
+          <w:rFonts w:ascii="Arial" w:hAnsi="Arial"/>
+          <w:sz w:val="20"/>
+        </w:rPr>
+        <w:t>â€¢ </w:t>
+      </w:r>
+      <w:r>
+        <w:rPr>
+          <w:rFonts w:ascii="Arial" w:hAnsi="Arial"/>
+          <w:b/>
+          <w:sz w:val="20"/>
+        </w:rPr>
+        <w:t>Step 3: Creative Role Elevation (Mangaka &amp; Assistant): </w:t>
+      </w:r>
+      <w:r>
+        <w:rPr>
+          <w:rFonts w:ascii="Arial" w:hAnsi="Arial"/>
+          <w:sz w:val="20"/>
+        </w:rPr>
+        <w:t>Admin creates the Mangaka account directly. For Assistants, they belong to a specific studio and can be provisioned through two options (see section 2.2).</w:t>
+      </w:r>
+    </w:p>
+    <w:p>
+      <w:pPr>
+        <w:pStyle w:val="Heading2"/>
+        <w:spacing w:before="240" w:after="120"/>
+      </w:pPr>
+      <w:r>
+        <w:rPr>
+          <w:rFonts w:ascii="Arial" w:hAnsi="Arial"/>
+          <w:b/>
+          <w:sz w:val="26"/>
+        </w:rPr>
+        <w:t>2.2 Screenflow for Account Provisioning</w:t>
+      </w:r>
+    </w:p>
+    <w:p>
+      <w:pPr>
+        <w:pStyle w:val="Heading3"/>
+        <w:spacing w:before="180" w:after="80"/>
+      </w:pPr>
+      <w:r>
+        <w:rPr>
+          <w:rFonts w:ascii="Arial" w:hAnsi="Arial"/>
+          <w:b/>
+          <w:sz w:val="22"/>
+        </w:rPr>
+        <w:t>2.2.1 Admin-Led Flow (Tantou Editor, Editorial Board, Mangaka)</w:t>
+      </w:r>
+    </w:p>
+    <w:p>
+      <w:pPr>
+        <w:spacing w:before="40" w:after="40"/>
+        <w:ind w:left="360"/>
+      </w:pPr>
+      <w:r>
+        <w:rPr>
+          <w:rFonts w:ascii="Arial" w:hAnsi="Arial"/>
+          <w:sz w:val="20"/>
+        </w:rPr>
+        <w:t>â€¢ </w:t>
+      </w:r>
+      <w:r>
+        <w:rPr>
+          <w:rFonts w:ascii="Arial" w:hAnsi="Arial"/>
+          <w:b/>
+          <w:sz w:val="20"/>
+        </w:rPr>
+        <w:t>Step 1: </w:t>
+      </w:r>
+      <w:r>
+        <w:rPr>
+          <w:rFonts w:ascii="Arial" w:hAnsi="Arial"/>
+          <w:sz w:val="20"/>
+        </w:rPr>
+        <w:t>Admin logs in, navigates to Admin Dashboard at '/admin/users' and clicks 'Create User' button.</w:t>
+      </w:r>
+    </w:p>
+    <w:p>
+      <w:pPr>
+        <w:spacing w:before="40" w:after="40"/>
+        <w:ind w:left="360"/>
+      </w:pPr>
+      <w:r>
+        <w:rPr>
+          <w:rFonts w:ascii="Arial" w:hAnsi="Arial"/>
+          <w:sz w:val="20"/>
+        </w:rPr>
+        <w:t>â€¢ </w:t>
+      </w:r>
+      <w:r>
+        <w:rPr>
+          <w:rFonts w:ascii="Arial" w:hAnsi="Arial"/>
+          <w:b/>
+          <w:sz w:val="20"/>
+        </w:rPr>
+        <w:t>Step 2: </w:t>
+      </w:r>
+      <w:r>
+        <w:rPr>
+          <w:rFonts w:ascii="Arial" w:hAnsi="Arial"/>
+          <w:sz w:val="20"/>
+        </w:rPr>
+        <w:t>Admin fills the registration form with Full Name, Username, Email, Password, and chooses the Role (TantouEditor, EditorialBoard, or Mangaka).</w:t>
+      </w:r>
+    </w:p>
+    <w:p>
+      <w:pPr>
+        <w:spacing w:before="40" w:after="40"/>
+        <w:ind w:left="360"/>
+      </w:pPr>
+      <w:r>
+        <w:rPr>
+          <w:rFonts w:ascii="Arial" w:hAnsi="Arial"/>
+          <w:sz w:val="20"/>
+        </w:rPr>
+        <w:t>â€¢ </w:t>
+      </w:r>
+      <w:r>
+        <w:rPr>
+          <w:rFonts w:ascii="Arial" w:hAnsi="Arial"/>
+          <w:b/>
+          <w:sz w:val="20"/>
+        </w:rPr>
+        <w:t>Step 3: </w:t>
+      </w:r>
+      <w:r>
+        <w:rPr>
+          <w:rFonts w:ascii="Arial" w:hAnsi="Arial"/>
+          <w:sz w:val="20"/>
+        </w:rPr>
+        <w:t>Admin clicks 'Save &amp; Register'. Frontend calls API 'POST /api/v1/auth/register'.</w:t>
+      </w:r>
+    </w:p>
+    <w:p>
+      <w:pPr>
+        <w:spacing w:before="40" w:after="40"/>
+        <w:ind w:left="360"/>
+      </w:pPr>
+      <w:r>
+        <w:rPr>
+          <w:rFonts w:ascii="Arial" w:hAnsi="Arial"/>
+          <w:sz w:val="20"/>
+        </w:rPr>
+        <w:t>â€¢ </w:t>
+      </w:r>
+      <w:r>
+        <w:rPr>
+          <w:rFonts w:ascii="Arial" w:hAnsi="Arial"/>
+          <w:b/>
+          <w:sz w:val="20"/>
+        </w:rPr>
+        <w:t>Step 4: </w:t>
+      </w:r>
+      <w:r>
+        <w:rPr>
+          <w:rFonts w:ascii="Arial" w:hAnsi="Arial"/>
+          <w:sz w:val="20"/>
+        </w:rPr>
+        <w:t>On Success (201 Created), modal closes, success toast shows, and the user management table is refreshed. On Error, validation messages display under fields.</w:t>
+      </w:r>
+    </w:p>
+    <w:p>
+      <w:pPr>
+        <w:pStyle w:val="Heading3"/>
+        <w:spacing w:before="180" w:after="80"/>
+      </w:pPr>
+      <w:r>
+        <w:rPr>
+          <w:rFonts w:ascii="Arial" w:hAnsi="Arial"/>
+          <w:b/>
+          <w:sz w:val="22"/>
+        </w:rPr>
+        <w:t>2.2.2 Assistant Flow - Option 1: Mangaka-Led Decentralized Flow</w:t>
+      </w:r>
+    </w:p>
+    <w:p>
+      <w:pPr>
+        <w:spacing w:before="40" w:after="40"/>
+        <w:ind w:left="360"/>
+      </w:pPr>
+      <w:r>
+        <w:rPr>
+          <w:rFonts w:ascii="Arial" w:hAnsi="Arial"/>
+          <w:sz w:val="20"/>
+        </w:rPr>
+        <w:t>â€¢ </w:t>
+      </w:r>
+      <w:r>
+        <w:rPr>
+          <w:rFonts w:ascii="Arial" w:hAnsi="Arial"/>
+          <w:b/>
+          <w:sz w:val="20"/>
+        </w:rPr>
+        <w:t>Step 1: </w:t>
+      </w:r>
+      <w:r>
+        <w:rPr>
+          <w:rFonts w:ascii="Arial" w:hAnsi="Arial"/>
+          <w:sz w:val="20"/>
+        </w:rPr>
+        <w:t>Mangaka goes to Studio Team management at '/studio/team' and clicks 'Add Assistant'.</w:t>
+      </w:r>
+    </w:p>
+    <w:p>
+      <w:pPr>
+        <w:spacing w:before="40" w:after="40"/>
+        <w:ind w:left="360"/>
+      </w:pPr>
+      <w:r>
+        <w:rPr>
+          <w:rFonts w:ascii="Arial" w:hAnsi="Arial"/>
+          <w:sz w:val="20"/>
+        </w:rPr>
+        <w:t>â€¢ </w:t>
+      </w:r>
+      <w:r>
+        <w:rPr>
+          <w:rFonts w:ascii="Arial" w:hAnsi="Arial"/>
+          <w:b/>
+          <w:sz w:val="20"/>
+        </w:rPr>
+        <w:t>Step 2: </w:t>
+      </w:r>
+      <w:r>
+        <w:rPr>
+          <w:rFonts w:ascii="Arial" w:hAnsi="Arial"/>
+          <w:sz w:val="20"/>
+        </w:rPr>
+        <w:t>Mangaka fills the form with Assistant's Full Name, Username, Email, and Temporary Password.</w:t>
+      </w:r>
+    </w:p>
+    <w:p>
+      <w:pPr>
+        <w:spacing w:before="40" w:after="40"/>
+        <w:ind w:left="360"/>
+      </w:pPr>
+      <w:r>
+        <w:rPr>
+          <w:rFonts w:ascii="Arial" w:hAnsi="Arial"/>
+          <w:sz w:val="20"/>
+        </w:rPr>
+        <w:t>â€¢ </w:t>
+      </w:r>
+      <w:r>
+        <w:rPr>
+          <w:rFonts w:ascii="Arial" w:hAnsi="Arial"/>
+          <w:b/>
+          <w:sz w:val="20"/>
+        </w:rPr>
+        <w:t>Step 3: </w:t>
+      </w:r>
+      <w:r>
+        <w:rPr>
+          <w:rFonts w:ascii="Arial" w:hAnsi="Arial"/>
+          <w:sz w:val="20"/>
+        </w:rPr>
+        <w:t>Mangaka clicks 'Create Account'. Frontend calls API 'POST /api/v1/auth/register' (Role: Assistant) and adds them directly to the studio's crew list.</w:t>
+      </w:r>
+    </w:p>
+    <w:p>
+      <w:pPr>
+        <w:pStyle w:val="Heading3"/>
+        <w:spacing w:before="180" w:after="80"/>
+      </w:pPr>
+      <w:r>
+        <w:rPr>
+          <w:rFonts w:ascii="Arial" w:hAnsi="Arial"/>
+          <w:b/>
+          <w:sz w:val="22"/>
+        </w:rPr>
+        <w:t>2.2.3 Assistant Flow - Option 2: Admin-Led Centralized Flow</w:t>
+      </w:r>
+    </w:p>
+    <w:p>
+      <w:pPr>
+        <w:spacing w:before="40" w:after="40"/>
+        <w:ind w:left="360"/>
+      </w:pPr>
+      <w:r>
+        <w:rPr>
+          <w:rFonts w:ascii="Arial" w:hAnsi="Arial"/>
+          <w:sz w:val="20"/>
+        </w:rPr>
+        <w:t>â€¢ </w:t>
+      </w:r>
+      <w:r>
+        <w:rPr>
+          <w:rFonts w:ascii="Arial" w:hAnsi="Arial"/>
+          <w:b/>
+          <w:sz w:val="20"/>
+        </w:rPr>
+        <w:t>Step 1: </w:t>
+      </w:r>
+      <w:r>
+        <w:rPr>
+          <w:rFonts w:ascii="Arial" w:hAnsi="Arial"/>
+          <w:sz w:val="20"/>
+        </w:rPr>
+        <w:t>Mangaka goes to '/studio/team' and clicks 'Request Assistant Account'.</w:t>
+      </w:r>
+    </w:p>
+    <w:p>
+      <w:pPr>
+        <w:spacing w:before="40" w:after="40"/>
+        <w:ind w:left="360"/>
+      </w:pPr>
+      <w:r>
+        <w:rPr>
+          <w:rFonts w:ascii="Arial" w:hAnsi="Arial"/>
+          <w:sz w:val="20"/>
+        </w:rPr>
+        <w:t>â€¢ </w:t>
+      </w:r>
+      <w:r>
+        <w:rPr>
+          <w:rFonts w:ascii="Arial" w:hAnsi="Arial"/>
+          <w:b/>
+          <w:sz w:val="20"/>
+        </w:rPr>
+        <w:t>Step 2: </w:t>
+      </w:r>
+      <w:r>
+        <w:rPr>
+          <w:rFonts w:ascii="Arial" w:hAnsi="Arial"/>
+          <w:sz w:val="20"/>
+        </w:rPr>
+        <w:t>Mangaka fills the request form with Assistant details (Name, Email, Preferred Username, Notes) and clicks 'Send Request'. Frontend calls API 'POST /api/v1/tasks/assistant-requests'.</w:t>
+      </w:r>
+    </w:p>
+    <w:p>
+      <w:pPr>
+        <w:spacing w:before="40" w:after="40"/>
+        <w:ind w:left="360"/>
+      </w:pPr>
+      <w:r>
+        <w:rPr>
+          <w:rFonts w:ascii="Arial" w:hAnsi="Arial"/>
+          <w:sz w:val="20"/>
+        </w:rPr>
+        <w:t>â€¢ </w:t>
+      </w:r>
+      <w:r>
+        <w:rPr>
+          <w:rFonts w:ascii="Arial" w:hAnsi="Arial"/>
+          <w:b/>
+          <w:sz w:val="20"/>
+        </w:rPr>
+        <w:t>Step 3: </w:t>
+      </w:r>
+      <w:r>
+        <w:rPr>
+          <w:rFonts w:ascii="Arial" w:hAnsi="Arial"/>
+          <w:sz w:val="20"/>
+        </w:rPr>
+        <w:t>Admin checks '/admin/requests/assistants' dashboard, selects the pending request, and clicks 'Approve &amp; Create'.</w:t>
+      </w:r>
+    </w:p>
+    <w:p>
+      <w:pPr>
+        <w:spacing w:before="40" w:after="40"/>
+        <w:ind w:left="360"/>
+      </w:pPr>
+      <w:r>
+        <w:rPr>
+          <w:rFonts w:ascii="Arial" w:hAnsi="Arial"/>
+          <w:sz w:val="20"/>
+        </w:rPr>
+        <w:t>â€¢ </w:t>
+      </w:r>
+      <w:r>
+        <w:rPr>
+          <w:rFonts w:ascii="Arial" w:hAnsi="Arial"/>
+          <w:b/>
+          <w:sz w:val="20"/>
+        </w:rPr>
+        <w:t>Step 4: </w:t>
+      </w:r>
+      <w:r>
+        <w:rPr>
+          <w:rFonts w:ascii="Arial" w:hAnsi="Arial"/>
+          <w:sz w:val="20"/>
+        </w:rPr>
+        <w:t>Frontend calls 'POST /api/v1/auth/register' (Role: Assistant) followed by 'PATCH /api/v1/tasks/assistant-requests/{id}' (Status: Approved). Account is created and automatically mapped to the requesting Mangaka's studio.</w:t>
+      </w:r>
+    </w:p>
+    <w:p>
+      <w:pPr>
         <w:spacing w:after="100" w:before="100"/>
       </w:pPr>
       <w:r>
@@ -1326,7 +1826,8 @@
           <w:sz w:val="22"/>
           <w:szCs w:val="22"/>
         </w:rPr>
-        <w:t xml:space="preserve"/>
+        <w:t xml:space="preserve">
+        </w:t>
       </w:r>
     </w:p>
     <w:p>
@@ -1360,7 +1861,7 @@
           <w:sz w:val="26"/>
           <w:szCs w:val="26"/>
         </w:rPr>
-        <w:t xml:space="preserve">MF1 — Series Submission &amp; Vetting Workflow</w:t>
+        <w:t xml:space="preserve">MF1 â€” Series Submission &amp; Vetting Workflow</w:t>
       </w:r>
     </w:p>
     <w:p>
@@ -1396,7 +1897,8 @@
           <w:sz w:val="22"/>
           <w:szCs w:val="22"/>
         </w:rPr>
-        <w:t xml:space="preserve"/>
+        <w:t xml:space="preserve">
+        </w:t>
       </w:r>
     </w:p>
     <w:p>
@@ -1624,7 +2126,7 @@
           <w:sz w:val="20"/>
           <w:szCs w:val="20"/>
         </w:rPr>
-        <w:t xml:space="preserve">Audits the manuscript. Verdict options: REJECTED (status → Rejected, notify creator, terminate thread) | REVISION REQUIRED (append correction logs, status → RevisionRequired, revert edit permissions — loop to Step 1) | APPROVED (proceed to Step 5).</w:t>
+        <w:t xml:space="preserve">Audits the manuscript. Verdict options: REJECTED (status â†’ Rejected, notify creator, terminate thread) | REVISION REQUIRED (append correction logs, status â†’ RevisionRequired, revert edit permissions â€” loop to Step 1) | APPROVED (proceed to Step 5).</w:t>
       </w:r>
     </w:p>
     <w:p>
@@ -1698,7 +2200,7 @@
           <w:sz w:val="26"/>
           <w:szCs w:val="26"/>
         </w:rPr>
-        <w:t xml:space="preserve">MF2 — Manga Production Workflow</w:t>
+        <w:t xml:space="preserve">MF2 â€” Manga Production Workflow</w:t>
       </w:r>
     </w:p>
     <w:p>
@@ -1734,7 +2236,8 @@
           <w:sz w:val="22"/>
           <w:szCs w:val="22"/>
         </w:rPr>
-        <w:t xml:space="preserve"/>
+        <w:t xml:space="preserve">
+        </w:t>
       </w:r>
     </w:p>
     <w:p>
@@ -1791,7 +2294,7 @@
           <w:sz w:val="20"/>
           <w:szCs w:val="20"/>
         </w:rPr>
-        <w:t xml:space="preserve">Generates a new chapter under an approved Active series. Defines TotalPages. Inside the Studio Dashboard: Scenario A (existing Assistant) — system binds user directly to ChapterTeams. Scenario B (new invitation) — system logs a secure time-bound token in AssistantInvitations and dispatches an email link that force-creates an Assistant account upon click.</w:t>
+        <w:t xml:space="preserve">Generates a new chapter under an approved Active series. Defines TotalPages. Inside the Studio Dashboard: Scenario A (existing Assistant) â€” system binds user directly to ChapterTeams. Scenario B (new invitation) â€” system logs a secure time-bound token in AssistantInvitations and dispatches an email link that force-creates an Assistant account upon click.</w:t>
       </w:r>
     </w:p>
     <w:p>
@@ -2076,7 +2579,7 @@
           <w:sz w:val="20"/>
           <w:szCs w:val="20"/>
         </w:rPr>
-        <w:t xml:space="preserve">YES → proceed to Step 8. NO → proceed to Step 7.</w:t>
+        <w:t xml:space="preserve">YES â†’ proceed to Step 8. NO â†’ proceed to Step 7.</w:t>
       </w:r>
     </w:p>
     <w:p>
@@ -2247,7 +2750,7 @@
           <w:sz w:val="20"/>
           <w:szCs w:val="20"/>
         </w:rPr>
-        <w:t xml:space="preserve">Evaluates: TotalApprovedPages == TotalConfiguredPages. NO → auto-increment to next page, unlock it (loop to Step 2). YES → proceed to Step 10.</w:t>
+        <w:t xml:space="preserve">Evaluates: TotalApprovedPages == TotalConfiguredPages. NO â†’ auto-increment to next page, unlock it (loop to Step 2). YES â†’ proceed to Step 10.</w:t>
       </w:r>
     </w:p>
     <w:p>
@@ -2321,7 +2824,7 @@
           <w:sz w:val="26"/>
           <w:szCs w:val="26"/>
         </w:rPr>
-        <w:t xml:space="preserve">MF3 — QA &amp; Publishing Flow</w:t>
+        <w:t xml:space="preserve">MF3 â€” QA &amp; Publishing Flow</w:t>
       </w:r>
     </w:p>
     <w:p>
@@ -2357,7 +2860,8 @@
           <w:sz w:val="22"/>
           <w:szCs w:val="22"/>
         </w:rPr>
-        <w:t xml:space="preserve"/>
+        <w:t xml:space="preserve">
+        </w:t>
       </w:r>
     </w:p>
     <w:p>
@@ -2471,7 +2975,7 @@
           <w:sz w:val="20"/>
           <w:szCs w:val="20"/>
         </w:rPr>
-        <w:t xml:space="preserve">NO → proceed to Step 5. YES → proceed to Step 3.</w:t>
+        <w:t xml:space="preserve">NO â†’ proceed to Step 5. YES â†’ proceed to Step 3.</w:t>
       </w:r>
     </w:p>
     <w:p>
@@ -2528,7 +3032,7 @@
           <w:sz w:val="20"/>
           <w:szCs w:val="20"/>
         </w:rPr>
-        <w:t xml:space="preserve">Anchors BugPins with percent-based coordinates (X, Y: 0.00–100.00), IssueType classification (Visual/Content/Text/Layout), and description notes. Compresses all pins into a single BatchToken delivery, forcing ChapterStatus to Rejected.</w:t>
+        <w:t xml:space="preserve">Anchors BugPins with percent-based coordinates (X, Y: 0.00â€“100.00), IssueType classification (Visual/Content/Text/Layout), and description notes. Compresses all pins into a single BatchToken delivery, forcing ChapterStatus to Rejected.</w:t>
       </w:r>
     </w:p>
     <w:p>
@@ -2871,7 +3375,8 @@
           <w:sz w:val="22"/>
           <w:szCs w:val="22"/>
         </w:rPr>
-        <w:t xml:space="preserve"/>
+        <w:t xml:space="preserve">
+        </w:t>
       </w:r>
     </w:p>
     <w:p>
@@ -3968,7 +4473,8 @@
           <w:sz w:val="22"/>
           <w:szCs w:val="22"/>
         </w:rPr>
-        <w:t xml:space="preserve"/>
+        <w:t xml:space="preserve">
+        </w:t>
       </w:r>
     </w:p>
     <w:p>
@@ -5044,7 +5550,7 @@
                 <w:sz w:val="20"/>
                 <w:szCs w:val="20"/>
               </w:rPr>
-              <w:t xml:space="preserve">DRAFT → PENDING; triggers lock &amp; route</w:t>
+              <w:t xml:space="preserve">DRAFT â†’ PENDING; triggers lock &amp; route</w:t>
             </w:r>
           </w:p>
         </w:tc>
@@ -5217,7 +5723,7 @@
                 <w:sz w:val="20"/>
                 <w:szCs w:val="20"/>
               </w:rPr>
-              <w:t xml:space="preserve">New file upload; status REVISION_REQUIRED → PENDING</w:t>
+              <w:t xml:space="preserve">New file upload; status REVISION_REQUIRED â†’ PENDING</w:t>
             </w:r>
           </w:p>
         </w:tc>
@@ -5563,7 +6069,7 @@
                 <w:sz w:val="20"/>
                 <w:szCs w:val="20"/>
               </w:rPr>
-              <w:t xml:space="preserve">Status → APPROVED; records ReviewedByUserId + ReviewedAt; triggers Series creation + role elevation</w:t>
+              <w:t xml:space="preserve">Status â†’ APPROVED; records ReviewedByUserId + ReviewedAt; triggers Series creation + role elevation</w:t>
             </w:r>
           </w:p>
         </w:tc>
@@ -5736,7 +6242,7 @@
                 <w:sz w:val="20"/>
                 <w:szCs w:val="20"/>
               </w:rPr>
-              <w:t xml:space="preserve">Status → REVISION_REQUIRED; FeedbackMessage required</w:t>
+              <w:t xml:space="preserve">Status â†’ REVISION_REQUIRED; FeedbackMessage required</w:t>
             </w:r>
           </w:p>
         </w:tc>
@@ -5909,7 +6415,7 @@
                 <w:sz w:val="20"/>
                 <w:szCs w:val="20"/>
               </w:rPr>
-              <w:t xml:space="preserve">Status → REJECTED; FeedbackMessage required</w:t>
+              <w:t xml:space="preserve">Status â†’ REJECTED; FeedbackMessage required</w:t>
             </w:r>
           </w:p>
         </w:tc>
@@ -5930,7 +6436,8 @@
           <w:sz w:val="22"/>
           <w:szCs w:val="22"/>
         </w:rPr>
-        <w:t xml:space="preserve"/>
+        <w:t xml:space="preserve">
+        </w:t>
       </w:r>
     </w:p>
     <w:p>
@@ -7006,7 +7513,7 @@
                 <w:sz w:val="20"/>
                 <w:szCs w:val="20"/>
               </w:rPr>
-              <w:t xml:space="preserve">Status → CANCELLED; notify Mangaka</w:t>
+              <w:t xml:space="preserve">Status â†’ CANCELLED; notify Mangaka</w:t>
             </w:r>
           </w:p>
         </w:tc>
@@ -7200,7 +7707,8 @@
           <w:sz w:val="22"/>
           <w:szCs w:val="22"/>
         </w:rPr>
-        <w:t xml:space="preserve"/>
+        <w:t xml:space="preserve">
+        </w:t>
       </w:r>
     </w:p>
     <w:p>
@@ -8449,7 +8957,7 @@
                 <w:sz w:val="20"/>
                 <w:szCs w:val="20"/>
               </w:rPr>
-              <w:t xml:space="preserve">Only when all pages Approved; Status → ReadyForQA</w:t>
+              <w:t xml:space="preserve">Only when all pages Approved; Status â†’ ReadyForQA</w:t>
             </w:r>
           </w:p>
         </w:tc>
@@ -8622,7 +9130,7 @@
                 <w:sz w:val="20"/>
                 <w:szCs w:val="20"/>
               </w:rPr>
-              <w:t xml:space="preserve">Status → ReadyForQA again</w:t>
+              <w:t xml:space="preserve">Status â†’ ReadyForQA again</w:t>
             </w:r>
           </w:p>
         </w:tc>
@@ -8989,7 +9497,8 @@
           <w:sz w:val="22"/>
           <w:szCs w:val="22"/>
         </w:rPr>
-        <w:t xml:space="preserve"/>
+        <w:t xml:space="preserve">
+        </w:t>
       </w:r>
     </w:p>
     <w:p>
@@ -9373,7 +9882,7 @@
                 <w:sz w:val="20"/>
                 <w:szCs w:val="20"/>
               </w:rPr>
-              <w:t xml:space="preserve">Sets AssignedAssistantId, LayerType, activates PageTask → Incomplete</w:t>
+              <w:t xml:space="preserve">Sets AssignedAssistantId, LayerType, activates PageTask â†’ Incomplete</w:t>
             </w:r>
           </w:p>
         </w:tc>
@@ -10238,7 +10747,7 @@
                 <w:sz w:val="20"/>
                 <w:szCs w:val="20"/>
               </w:rPr>
-              <w:t xml:space="preserve">Upload .png; TaskStatus → Reviewing; MF5 optimizes async</w:t>
+              <w:t xml:space="preserve">Upload .png; TaskStatus â†’ Reviewing; MF5 optimizes async</w:t>
             </w:r>
           </w:p>
         </w:tc>
@@ -10411,7 +10920,7 @@
                 <w:sz w:val="20"/>
                 <w:szCs w:val="20"/>
               </w:rPr>
-              <w:t xml:space="preserve">TaskStatus → Approved; triggers merge check for page</w:t>
+              <w:t xml:space="preserve">TaskStatus â†’ Approved; triggers merge check for page</w:t>
             </w:r>
           </w:p>
         </w:tc>
@@ -10584,7 +11093,7 @@
                 <w:sz w:val="20"/>
                 <w:szCs w:val="20"/>
               </w:rPr>
-              <w:t xml:space="preserve">TaskStatus → RevisionAlert; RejectionNote saved; notify assistant</w:t>
+              <w:t xml:space="preserve">TaskStatus â†’ RevisionAlert; RejectionNote saved; notify assistant</w:t>
             </w:r>
           </w:p>
         </w:tc>
@@ -10757,7 +11266,7 @@
                 <w:sz w:val="20"/>
                 <w:szCs w:val="20"/>
               </w:rPr>
-              <w:t xml:space="preserve">ACCEPTED tasks × rate per month</w:t>
+              <w:t xml:space="preserve">ACCEPTED tasks Ã— rate per month</w:t>
             </w:r>
           </w:p>
         </w:tc>
@@ -10951,7 +11460,8 @@
           <w:sz w:val="22"/>
           <w:szCs w:val="22"/>
         </w:rPr>
-        <w:t xml:space="preserve"/>
+        <w:t xml:space="preserve">
+        </w:t>
       </w:r>
     </w:p>
     <w:p>
@@ -11681,7 +12191,7 @@
                 <w:sz w:val="20"/>
                 <w:szCs w:val="20"/>
               </w:rPr>
-              <w:t xml:space="preserve">Coordinate (X,Y) 0–100%, IssueType, NoteMessage</w:t>
+              <w:t xml:space="preserve">Coordinate (X,Y) 0â€“100%, IssueType, NoteMessage</w:t>
             </w:r>
           </w:p>
         </w:tc>
@@ -12200,7 +12710,7 @@
                 <w:sz w:val="20"/>
                 <w:szCs w:val="20"/>
               </w:rPr>
-              <w:t xml:space="preserve">Groups pins under BatchToken; Chapter.Status → Rejected; notify Mangaka</w:t>
+              <w:t xml:space="preserve">Groups pins under BatchToken; Chapter.Status â†’ Rejected; notify Mangaka</w:t>
             </w:r>
           </w:p>
         </w:tc>
@@ -12546,7 +13056,7 @@
                 <w:sz w:val="20"/>
                 <w:szCs w:val="20"/>
               </w:rPr>
-              <w:t xml:space="preserve">All pins → Resolved; Chapter.Status → Approved; triggers Step 6</w:t>
+              <w:t xml:space="preserve">All pins â†’ Resolved; Chapter.Status â†’ Approved; triggers Step 6</w:t>
             </w:r>
           </w:p>
         </w:tc>
@@ -12567,7 +13077,8 @@
           <w:sz w:val="22"/>
           <w:szCs w:val="22"/>
         </w:rPr>
-        <w:t xml:space="preserve"/>
+        <w:t xml:space="preserve">
+        </w:t>
       </w:r>
     </w:p>
     <w:p>
@@ -13837,7 +14348,8 @@
           <w:sz w:val="22"/>
           <w:szCs w:val="22"/>
         </w:rPr>
-        <w:t xml:space="preserve"/>
+        <w:t xml:space="preserve">
+        </w:t>
       </w:r>
     </w:p>
     <w:p>
@@ -13859,7 +14371,7 @@
           <w:sz w:val="32"/>
           <w:szCs w:val="32"/>
         </w:rPr>
-        <w:t xml:space="preserve">5. Database Architecture (SQL Server — v2 Revised)</w:t>
+        <w:t xml:space="preserve">5. Database Architecture (SQL Server â€” v2 Revised)</w:t>
       </w:r>
     </w:p>
     <w:p>
@@ -13895,7 +14407,8 @@
           <w:sz w:val="22"/>
           <w:szCs w:val="22"/>
         </w:rPr>
-        <w:t xml:space="preserve"/>
+        <w:t xml:space="preserve">
+        </w:t>
       </w:r>
     </w:p>
     <w:p>
@@ -13948,7 +14461,8 @@
           <w:sz w:val="22"/>
           <w:szCs w:val="22"/>
         </w:rPr>
-        <w:t xml:space="preserve"/>
+        <w:t xml:space="preserve">
+        </w:t>
       </w:r>
     </w:p>
     <w:tbl>
@@ -14419,7 +14933,7 @@
                 <w:sz w:val="20"/>
                 <w:szCs w:val="20"/>
               </w:rPr>
-              <w:t xml:space="preserve">ReviewedByUserId FK → Users, ReviewedAt DATETIME2</w:t>
+              <w:t xml:space="preserve">ReviewedByUserId FK â†’ Users, ReviewedAt DATETIME2</w:t>
             </w:r>
           </w:p>
         </w:tc>
@@ -14765,7 +15279,7 @@
                 <w:sz w:val="20"/>
                 <w:szCs w:val="20"/>
               </w:rPr>
-              <w:t xml:space="preserve">AssignedEditorId FK → Users, PublishedAt DATETIME2</w:t>
+              <w:t xml:space="preserve">AssignedEditorId FK â†’ Users, PublishedAt DATETIME2</w:t>
             </w:r>
           </w:p>
         </w:tc>
@@ -15111,7 +15625,7 @@
                 <w:sz w:val="20"/>
                 <w:szCs w:val="20"/>
               </w:rPr>
-              <w:t xml:space="preserve">CreatedAt DATETIME2, InvitedByUserId FK → Users</w:t>
+              <w:t xml:space="preserve">CreatedAt DATETIME2, InvitedByUserId FK â†’ Users</w:t>
             </w:r>
           </w:p>
         </w:tc>
@@ -15284,7 +15798,7 @@
                 <w:sz w:val="20"/>
                 <w:szCs w:val="20"/>
               </w:rPr>
-              <w:t xml:space="preserve">AssignedAssistantId FK → Users (NOT NULL capable), CreatedAt</w:t>
+              <w:t xml:space="preserve">AssignedAssistantId FK â†’ Users (NOT NULL capable), CreatedAt</w:t>
             </w:r>
           </w:p>
         </w:tc>
@@ -15803,7 +16317,7 @@
                 <w:sz w:val="20"/>
                 <w:szCs w:val="20"/>
               </w:rPr>
-              <w:t xml:space="preserve">ChapterId FK → Chapters, IssueType NVARCHAR(50) + CHECK, ResolvedAt DATETIME2</w:t>
+              <w:t xml:space="preserve">ChapterId FK â†’ Chapters, IssueType NVARCHAR(50) + CHECK, ResolvedAt DATETIME2</w:t>
             </w:r>
           </w:p>
         </w:tc>
@@ -15837,7 +16351,7 @@
                 <w:sz w:val="20"/>
                 <w:szCs w:val="20"/>
               </w:rPr>
-              <w:t xml:space="preserve">CRITICAL: Without ChapterId, loading all pins for a chapter requires double JOIN — slow on large chapters</w:t>
+              <w:t xml:space="preserve">CRITICAL: Without ChapterId, loading all pins for a chapter requires double JOIN â€” slow on large chapters</w:t>
             </w:r>
           </w:p>
         </w:tc>
@@ -16239,7 +16753,8 @@
           <w:sz w:val="22"/>
           <w:szCs w:val="22"/>
         </w:rPr>
-        <w:t xml:space="preserve"/>
+        <w:t xml:space="preserve">
+        </w:t>
       </w:r>
     </w:p>
     <w:p>
@@ -16274,7 +16789,8 @@
           <w:sz w:val="22"/>
           <w:szCs w:val="22"/>
         </w:rPr>
-        <w:t xml:space="preserve"/>
+        <w:t xml:space="preserve">
+        </w:t>
       </w:r>
     </w:p>
     <w:tbl>
@@ -16606,7 +17122,7 @@
                 <w:sz w:val="20"/>
                 <w:szCs w:val="20"/>
               </w:rPr>
-              <w:t xml:space="preserve">JWT lifecycle: invalidate tokens on logout and on role elevation (Reader → Mangaka)</w:t>
+              <w:t xml:space="preserve">JWT lifecycle: invalidate tokens on logout and on role elevation (Reader â†’ Mangaka)</w:t>
             </w:r>
           </w:p>
         </w:tc>
@@ -17181,7 +17697,8 @@
           <w:sz w:val="22"/>
           <w:szCs w:val="22"/>
         </w:rPr>
-        <w:t xml:space="preserve"/>
+        <w:t xml:space="preserve">
+        </w:t>
       </w:r>
     </w:p>
     <w:p>
@@ -17234,7 +17751,8 @@
           <w:sz w:val="22"/>
           <w:szCs w:val="22"/>
         </w:rPr>
-        <w:t xml:space="preserve"/>
+        <w:t xml:space="preserve">
+        </w:t>
       </w:r>
     </w:p>
     <w:p>
@@ -17333,7 +17851,7 @@
           <w:sz w:val="26"/>
           <w:szCs w:val="26"/>
         </w:rPr>
-        <w:t xml:space="preserve">MF5 — Asset Upload &amp; Optimization Flow</w:t>
+        <w:t xml:space="preserve">MF5 â€” Asset Upload &amp; Optimization Flow</w:t>
       </w:r>
     </w:p>
     <w:p>
@@ -17368,7 +17886,7 @@
           <w:sz w:val="26"/>
           <w:szCs w:val="26"/>
         </w:rPr>
-        <w:t xml:space="preserve">MF6 — Real-time Notification Flow</w:t>
+        <w:t xml:space="preserve">MF6 â€” Real-time Notification Flow</w:t>
       </w:r>
     </w:p>
     <w:p>
@@ -17403,7 +17921,7 @@
           <w:sz w:val="26"/>
           <w:szCs w:val="26"/>
         </w:rPr>
-        <w:t xml:space="preserve">MF7 — Version Control &amp; History Log Flow (Audit Trail)</w:t>
+        <w:t xml:space="preserve">MF7 â€” Version Control &amp; History Log Flow (Audit Trail)</w:t>
       </w:r>
     </w:p>
     <w:p>
@@ -17438,7 +17956,7 @@
           <w:sz w:val="26"/>
           <w:szCs w:val="26"/>
         </w:rPr>
-        <w:t xml:space="preserve">MF8 — Web Cache Invalidation Flow</w:t>
+        <w:t xml:space="preserve">MF8 â€” Web Cache Invalidation Flow</w:t>
       </w:r>
     </w:p>
     <w:p>
@@ -17568,7 +18086,7 @@
           <w:sz w:val="21"/>
           <w:szCs w:val="21"/>
         </w:rPr>
-        <w:t xml:space="preserve">Asset pipeline: Hangfire + ImageSharp for async .png → .webp conversion</w:t>
+        <w:t xml:space="preserve">Asset pipeline: Hangfire + ImageSharp for async .png â†’ .webp conversion</w:t>
       </w:r>
     </w:p>
     <w:p>
@@ -17643,7 +18161,8 @@
           <w:sz w:val="22"/>
           <w:szCs w:val="22"/>
         </w:rPr>
-        <w:t xml:space="preserve"/>
+        <w:t xml:space="preserve">
+        </w:t>
       </w:r>
     </w:p>
     <w:p>
@@ -17674,11 +18193,7 @@
 </w:document>
 </file>
 
-<file path=word/comments.xml><?xml version="1.0" encoding="utf-8"?>
-<w:comments xmlns:cx="http://schemas.microsoft.com/office/drawing/2014/chartex" xmlns:cx1="http://schemas.microsoft.com/office/drawing/2015/9/8/chartex" xmlns:cx2="http://schemas.microsoft.com/office/drawing/2015/10/21/chartex" xmlns:cx3="http://schemas.microsoft.com/office/drawing/2016/5/9/chartex" xmlns:cx4="http://schemas.microsoft.com/office/drawing/2016/5/10/chartex" xmlns:cx5="http://schemas.microsoft.com/office/drawing/2016/5/11/chartex" xmlns:cx6="http://schemas.microsoft.com/office/drawing/2016/5/12/chartex" xmlns:cx7="http://schemas.microsoft.com/office/drawing/2016/5/13/chartex" xmlns:cx8="http://schemas.microsoft.com/office/drawing/2016/5/14/chartex" xmlns:mc="http://schemas.openxmlformats.org/markup-compatibility/2006" xmlns:aink="http://schemas.microsoft.com/office/drawing/2016/ink" xmlns:am3d="http://schemas.microsoft.com/office/drawing/2017/model3d" xmlns:o="urn:schemas-microsoft-com:office:office" xmlns:r="http://schemas.openxmlformats.org/officeDocument/2006/relationships" xmlns:m="http://schemas.openxmlformats.org/officeDocument/2006/math" xmlns:v="urn:schemas-microsoft-com:vml" xmlns:wp14="http://schemas.microsoft.com/office/word/2010/wordprocessingDrawing" xmlns:wp="http://schemas.openxmlformats.org/drawingml/2006/wordprocessingDrawing" xmlns:w10="urn:schemas-microsoft-com:office:word" xmlns:w="http://schemas.openxmlformats.org/wordprocessingml/2006/main" xmlns:w14="http://schemas.microsoft.com/office/word/2010/wordml" xmlns:w15="http://schemas.microsoft.com/office/word/2012/wordml" xmlns:w16cex="http://schemas.microsoft.com/office/word/2018/wordml/cex" xmlns:w16cid="http://schemas.microsoft.com/office/word/2016/wordml/cid" xmlns:w16="http://schemas.microsoft.com/office/word/2018/wordml" xmlns:w16sdtdh="http://schemas.microsoft.com/office/word/2020/wordml/sdtdatahash" xmlns:w16se="http://schemas.microsoft.com/office/word/2015/wordml/symex" xmlns:wpg="http://schemas.microsoft.com/office/word/2010/wordprocessingGroup" xmlns:wpi="http://schemas.microsoft.com/office/word/2010/wordprocessingInk" xmlns:wne="http://schemas.microsoft.com/office/word/2006/wordml" xmlns:wps="http://schemas.microsoft.com/office/word/2010/wordprocessingShape"/>
-</file>
-
-<file path=word/endnotes.xml><?xml version="1.0" encoding="utf-8"?>
+<file path=word\endnotes.xml><?xml version="1.0" encoding="utf-8"?>
 <w:endnotes xmlns:wpc="http://schemas.microsoft.com/office/word/2010/wordprocessingCanvas" xmlns:mc="http://schemas.openxmlformats.org/markup-compatibility/2006" xmlns:o="urn:schemas-microsoft-com:office:office" xmlns:r="http://schemas.openxmlformats.org/officeDocument/2006/relationships" xmlns:m="http://schemas.openxmlformats.org/officeDocument/2006/math" xmlns:v="urn:schemas-microsoft-com:vml" xmlns:wp14="http://schemas.microsoft.com/office/word/2010/wordprocessingDrawing" xmlns:wp="http://schemas.openxmlformats.org/drawingml/2006/wordprocessingDrawing" xmlns:w10="urn:schemas-microsoft-com:office:word" xmlns:w="http://schemas.openxmlformats.org/wordprocessingml/2006/main" xmlns:w14="http://schemas.microsoft.com/office/word/2010/wordml" xmlns:w15="http://schemas.microsoft.com/office/word/2012/wordml" xmlns:wpg="http://schemas.microsoft.com/office/word/2010/wordprocessingGroup" xmlns:wpi="http://schemas.microsoft.com/office/word/2010/wordprocessingInk" xmlns:wne="http://schemas.microsoft.com/office/word/2006/wordml" xmlns:wps="http://schemas.microsoft.com/office/word/2010/wordprocessingShape" mc:Ignorable="w14 w15 wp14">
   <w:endnote w:type="separator" w:id="-1">
     <w:p>
@@ -17715,7 +18230,11 @@
 </w:endnotes>
 </file>
 
-<file path=word/footnotes.xml><?xml version="1.0" encoding="utf-8"?>
+<file path=word\fontTable.xml><?xml version="1.0" encoding="utf-8"?>
+<w:fonts xmlns:mc="http://schemas.openxmlformats.org/markup-compatibility/2006" xmlns:r="http://schemas.openxmlformats.org/officeDocument/2006/relationships" xmlns:w="http://schemas.openxmlformats.org/wordprocessingml/2006/main" xmlns:w14="http://schemas.microsoft.com/office/word/2010/wordml" xmlns:w15="http://schemas.microsoft.com/office/word/2012/wordml" xmlns:w16cex="http://schemas.microsoft.com/office/word/2018/wordml/cex" xmlns:w16cid="http://schemas.microsoft.com/office/word/2016/wordml/cid" xmlns:w16="http://schemas.microsoft.com/office/word/2018/wordml" xmlns:w16sdtdh="http://schemas.microsoft.com/office/word/2020/wordml/sdtdatahash" xmlns:w16se="http://schemas.microsoft.com/office/word/2015/wordml/symex" mc:Ignorable="w14 w15 w16se w16cid w16 w16cex w16sdtdh"/>
+</file>
+
+<file path=word\footnotes.xml><?xml version="1.0" encoding="utf-8"?>
 <w:footnotes xmlns:wpc="http://schemas.microsoft.com/office/word/2010/wordprocessingCanvas" xmlns:mc="http://schemas.openxmlformats.org/markup-compatibility/2006" xmlns:o="urn:schemas-microsoft-com:office:office" xmlns:r="http://schemas.openxmlformats.org/officeDocument/2006/relationships" xmlns:m="http://schemas.openxmlformats.org/officeDocument/2006/math" xmlns:v="urn:schemas-microsoft-com:vml" xmlns:wp14="http://schemas.microsoft.com/office/word/2010/wordprocessingDrawing" xmlns:wp="http://schemas.openxmlformats.org/drawingml/2006/wordprocessingDrawing" xmlns:w10="urn:schemas-microsoft-com:office:word" xmlns:w="http://schemas.openxmlformats.org/wordprocessingml/2006/main" xmlns:w14="http://schemas.microsoft.com/office/word/2010/wordml" xmlns:w15="http://schemas.microsoft.com/office/word/2012/wordml" xmlns:wpg="http://schemas.microsoft.com/office/word/2010/wordprocessingGroup" xmlns:wpi="http://schemas.microsoft.com/office/word/2010/wordprocessingInk" xmlns:wne="http://schemas.microsoft.com/office/word/2006/wordml" xmlns:wps="http://schemas.microsoft.com/office/word/2010/wordprocessingShape" mc:Ignorable="w14 w15 wp14">
   <w:footnote w:type="separator" w:id="-1">
     <w:p>
@@ -17752,7 +18271,7 @@
 </w:footnotes>
 </file>
 
-<file path=word/numbering.xml><?xml version="1.0" encoding="utf-8"?>
+<file path=word\numbering.xml><?xml version="1.0" encoding="utf-8"?>
 <w:numbering xmlns:wpc="http://schemas.microsoft.com/office/word/2010/wordprocessingCanvas" xmlns:mc="http://schemas.openxmlformats.org/markup-compatibility/2006" xmlns:o="urn:schemas-microsoft-com:office:office" xmlns:r="http://schemas.openxmlformats.org/officeDocument/2006/relationships" xmlns:m="http://schemas.openxmlformats.org/officeDocument/2006/math" xmlns:v="urn:schemas-microsoft-com:vml" xmlns:wp14="http://schemas.microsoft.com/office/word/2010/wordprocessingDrawing" xmlns:wp="http://schemas.openxmlformats.org/drawingml/2006/wordprocessingDrawing" xmlns:w10="urn:schemas-microsoft-com:office:word" xmlns:w="http://schemas.openxmlformats.org/wordprocessingml/2006/main" xmlns:w14="http://schemas.microsoft.com/office/word/2010/wordml" xmlns:w15="http://schemas.microsoft.com/office/word/2012/wordml" xmlns:wpg="http://schemas.microsoft.com/office/word/2010/wordprocessingGroup" xmlns:wpi="http://schemas.microsoft.com/office/word/2010/wordprocessingInk" xmlns:wne="http://schemas.microsoft.com/office/word/2006/wordml" xmlns:wps="http://schemas.microsoft.com/office/word/2010/wordprocessingShape" mc:Ignorable="w14 w15 wp14">
   <w:abstractNum w:abstractNumId="1" w15:restartNumberingAfterBreak="0">
     <w:multiLevelType w:val="hybridMultilevel"/>
@@ -17889,7 +18408,17 @@
 </w:numbering>
 </file>
 
-<file path=word/styles.xml><?xml version="1.0" encoding="utf-8"?>
+<file path=word\settings.xml><?xml version="1.0" encoding="utf-8"?>
+<w:settings xmlns:wpc="http://schemas.microsoft.com/office/word/2010/wordprocessingCanvas" xmlns:mc="http://schemas.openxmlformats.org/markup-compatibility/2006" xmlns:o="urn:schemas-microsoft-com:office:office" xmlns:r="http://schemas.openxmlformats.org/officeDocument/2006/relationships" xmlns:m="http://schemas.openxmlformats.org/officeDocument/2006/math" xmlns:v="urn:schemas-microsoft-com:vml" xmlns:wp14="http://schemas.microsoft.com/office/word/2010/wordprocessingDrawing" xmlns:wp="http://schemas.openxmlformats.org/drawingml/2006/wordprocessingDrawing" xmlns:w10="urn:schemas-microsoft-com:office:word" xmlns:w="http://schemas.openxmlformats.org/wordprocessingml/2006/main" xmlns:w14="http://schemas.microsoft.com/office/word/2010/wordml" xmlns:w15="http://schemas.microsoft.com/office/word/2012/wordml" xmlns:wpg="http://schemas.microsoft.com/office/word/2010/wordprocessingGroup" xmlns:wpi="http://schemas.microsoft.com/office/word/2010/wordprocessingInk" xmlns:wne="http://schemas.microsoft.com/office/word/2006/wordml" xmlns:wps="http://schemas.microsoft.com/office/word/2010/wordprocessingShape" mc:Ignorable="w14 w15 wp14">
+  <w:displayBackgroundShape/>
+  <w:evenAndOddHeaders w:val="false"/>
+  <w:compat>
+    <w:compatSetting w:val="15" w:name="compatibilityMode" w:uri="http://schemas.microsoft.com/office/word"/>
+  </w:compat>
+</w:settings>
+</file>
+
+<file path=word\styles.xml><?xml version="1.0" encoding="utf-8"?>
 <w:styles xmlns:mc="http://schemas.openxmlformats.org/markup-compatibility/2006" xmlns:r="http://schemas.openxmlformats.org/officeDocument/2006/relationships" xmlns:w="http://schemas.openxmlformats.org/wordprocessingml/2006/main" xmlns:w14="http://schemas.microsoft.com/office/word/2010/wordml" xmlns:w15="http://schemas.microsoft.com/office/word/2012/wordml" mc:Ignorable="w14 w15">
   <w:docDefaults>
     <w:rPrDefault>

</xml_diff>